<commit_message>
kubernetes - controllers updated
</commit_message>
<xml_diff>
--- a/Kubernetes/5-controllers.docx
+++ b/Kubernetes/5-controllers.docx
@@ -1,10 +1,10 @@
 
 <file path=word/document.xml><?xml version="1.0" encoding="utf-8"?>
-<w:document xmlns:wpc="http://schemas.microsoft.com/office/word/2010/wordprocessingCanvas" xmlns:cx="http://schemas.microsoft.com/office/drawing/2014/chartex" xmlns:cx1="http://schemas.microsoft.com/office/drawing/2015/9/8/chartex" xmlns:cx2="http://schemas.microsoft.com/office/drawing/2015/10/21/chartex" xmlns:cx3="http://schemas.microsoft.com/office/drawing/2016/5/9/chartex" xmlns:cx4="http://schemas.microsoft.com/office/drawing/2016/5/10/chartex" xmlns:cx5="http://schemas.microsoft.com/office/drawing/2016/5/11/chartex" xmlns:cx6="http://schemas.microsoft.com/office/drawing/2016/5/12/chartex" xmlns:cx7="http://schemas.microsoft.com/office/drawing/2016/5/13/chartex" xmlns:cx8="http://schemas.microsoft.com/office/drawing/2016/5/14/chartex" xmlns:mc="http://schemas.openxmlformats.org/markup-compatibility/2006" xmlns:aink="http://schemas.microsoft.com/office/drawing/2016/ink" xmlns:am3d="http://schemas.microsoft.com/office/drawing/2017/model3d" xmlns:o="urn:schemas-microsoft-com:office:office" xmlns:oel="http://schemas.microsoft.com/office/2019/extlst" xmlns:r="http://schemas.openxmlformats.org/officeDocument/2006/relationships" xmlns:m="http://schemas.openxmlformats.org/officeDocument/2006/math" xmlns:v="urn:schemas-microsoft-com:vml" xmlns:wp14="http://schemas.microsoft.com/office/word/2010/wordprocessingDrawing" xmlns:wp="http://schemas.openxmlformats.org/drawingml/2006/wordprocessingDrawing" xmlns:w10="urn:schemas-microsoft-com:office:word" xmlns:w="http://schemas.openxmlformats.org/wordprocessingml/2006/main" xmlns:w14="http://schemas.microsoft.com/office/word/2010/wordml" xmlns:w15="http://schemas.microsoft.com/office/word/2012/wordml" xmlns:w16cex="http://schemas.microsoft.com/office/word/2018/wordml/cex" xmlns:w16cid="http://schemas.microsoft.com/office/word/2016/wordml/cid" xmlns:w16="http://schemas.microsoft.com/office/word/2018/wordml" xmlns:w16sdtdh="http://schemas.microsoft.com/office/word/2020/wordml/sdtdatahash" xmlns:w16se="http://schemas.microsoft.com/office/word/2015/wordml/symex" xmlns:wpg="http://schemas.microsoft.com/office/word/2010/wordprocessingGroup" xmlns:wpi="http://schemas.microsoft.com/office/word/2010/wordprocessingInk" xmlns:wne="http://schemas.microsoft.com/office/word/2006/wordml" xmlns:wps="http://schemas.microsoft.com/office/word/2010/wordprocessingShape" mc:Ignorable="w14 w15 w16se w16cid w16 w16cex w16sdtdh wp14">
+<w:document xmlns:wpc="http://schemas.microsoft.com/office/word/2010/wordprocessingCanvas" xmlns:cx="http://schemas.microsoft.com/office/drawing/2014/chartex" xmlns:cx1="http://schemas.microsoft.com/office/drawing/2015/9/8/chartex" xmlns:cx2="http://schemas.microsoft.com/office/drawing/2015/10/21/chartex" xmlns:cx3="http://schemas.microsoft.com/office/drawing/2016/5/9/chartex" xmlns:cx4="http://schemas.microsoft.com/office/drawing/2016/5/10/chartex" xmlns:cx5="http://schemas.microsoft.com/office/drawing/2016/5/11/chartex" xmlns:cx6="http://schemas.microsoft.com/office/drawing/2016/5/12/chartex" xmlns:cx7="http://schemas.microsoft.com/office/drawing/2016/5/13/chartex" xmlns:cx8="http://schemas.microsoft.com/office/drawing/2016/5/14/chartex" xmlns:mc="http://schemas.openxmlformats.org/markup-compatibility/2006" xmlns:aink="http://schemas.microsoft.com/office/drawing/2016/ink" xmlns:am3d="http://schemas.microsoft.com/office/drawing/2017/model3d" xmlns:o="urn:schemas-microsoft-com:office:office" xmlns:oel="http://schemas.microsoft.com/office/2019/extlst" xmlns:r="http://schemas.openxmlformats.org/officeDocument/2006/relationships" xmlns:m="http://schemas.openxmlformats.org/officeDocument/2006/math" xmlns:v="urn:schemas-microsoft-com:vml" xmlns:wp14="http://schemas.microsoft.com/office/word/2010/wordprocessingDrawing" xmlns:wp="http://schemas.openxmlformats.org/drawingml/2006/wordprocessingDrawing" xmlns:w10="urn:schemas-microsoft-com:office:word" xmlns:w="http://schemas.openxmlformats.org/wordprocessingml/2006/main" xmlns:w14="http://schemas.microsoft.com/office/word/2010/wordml" xmlns:w15="http://schemas.microsoft.com/office/word/2012/wordml" xmlns:w16cex="http://schemas.microsoft.com/office/word/2018/wordml/cex" xmlns:w16cid="http://schemas.microsoft.com/office/word/2016/wordml/cid" xmlns:w16="http://schemas.microsoft.com/office/word/2018/wordml" xmlns:w16du="http://schemas.microsoft.com/office/word/2023/wordml/word16du" xmlns:w16sdtdh="http://schemas.microsoft.com/office/word/2020/wordml/sdtdatahash" xmlns:w16sdtfl="http://schemas.microsoft.com/office/word/2024/wordml/sdtformatlock" xmlns:w16se="http://schemas.microsoft.com/office/word/2015/wordml/symex" xmlns:wpg="http://schemas.microsoft.com/office/word/2010/wordprocessingGroup" xmlns:wpi="http://schemas.microsoft.com/office/word/2010/wordprocessingInk" xmlns:wne="http://schemas.microsoft.com/office/word/2006/wordml" xmlns:wps="http://schemas.microsoft.com/office/word/2010/wordprocessingShape" mc:Ignorable="w14 w15 w16se w16cid w16 w16cex w16sdtdh w16sdtfl w16du wp14">
   <w:body>
     <w:p>
       <w:pPr>
-        <w:spacing w:after="120"/>
+        <w:spacing w:after="60"/>
         <w:jc w:val="both"/>
         <w:rPr>
           <w:rFonts w:asciiTheme="majorBidi" w:hAnsiTheme="majorBidi" w:cstheme="majorBidi"/>
@@ -273,7 +273,6 @@
         <w:t xml:space="preserve"> apply -f </w:t>
       </w:r>
       <w:proofErr w:type="spellStart"/>
-      <w:proofErr w:type="gramStart"/>
       <w:r>
         <w:rPr>
           <w:rFonts w:asciiTheme="majorBidi" w:hAnsiTheme="majorBidi" w:cstheme="majorBidi"/>
@@ -287,7 +286,6 @@
         <w:t>pod.yaml</w:t>
       </w:r>
       <w:proofErr w:type="spellEnd"/>
-      <w:proofErr w:type="gramEnd"/>
       <w:r>
         <w:rPr>
           <w:rFonts w:asciiTheme="majorBidi" w:hAnsiTheme="majorBidi" w:cstheme="majorBidi"/>
@@ -338,23 +336,13 @@
         </w:rPr>
         <w:t xml:space="preserve">, </w:t>
       </w:r>
-      <w:proofErr w:type="gramStart"/>
-      <w:r>
-        <w:rPr>
-          <w:rFonts w:asciiTheme="majorBidi" w:hAnsiTheme="majorBidi" w:cstheme="majorBidi"/>
-          <w:sz w:val="28"/>
-          <w:szCs w:val="28"/>
-        </w:rPr>
-        <w:t>Nothing</w:t>
-      </w:r>
-      <w:proofErr w:type="gramEnd"/>
-      <w:r>
-        <w:rPr>
-          <w:rFonts w:asciiTheme="majorBidi" w:hAnsiTheme="majorBidi" w:cstheme="majorBidi"/>
-          <w:sz w:val="28"/>
-          <w:szCs w:val="28"/>
-        </w:rPr>
-        <w:t xml:space="preserve"> replaces it.</w:t>
+      <w:r>
+        <w:rPr>
+          <w:rFonts w:asciiTheme="majorBidi" w:hAnsiTheme="majorBidi" w:cstheme="majorBidi"/>
+          <w:sz w:val="28"/>
+          <w:szCs w:val="28"/>
+        </w:rPr>
+        <w:t>Nothing replaces it.</w:t>
       </w:r>
     </w:p>
     <w:p>
@@ -394,33 +382,15 @@
           <w:sz w:val="28"/>
           <w:szCs w:val="28"/>
         </w:rPr>
-        <w:t xml:space="preserve">For </w:t>
-      </w:r>
-      <w:proofErr w:type="gramStart"/>
-      <w:r>
-        <w:rPr>
-          <w:rFonts w:asciiTheme="majorBidi" w:hAnsiTheme="majorBidi" w:cstheme="majorBidi"/>
-          <w:sz w:val="28"/>
-          <w:szCs w:val="28"/>
-        </w:rPr>
-        <w:t>e</w:t>
-      </w:r>
-      <w:r>
-        <w:rPr>
-          <w:rFonts w:asciiTheme="majorBidi" w:hAnsiTheme="majorBidi" w:cstheme="majorBidi"/>
-          <w:sz w:val="28"/>
-          <w:szCs w:val="28"/>
-        </w:rPr>
-        <w:t>xample</w:t>
-      </w:r>
-      <w:proofErr w:type="gramEnd"/>
-      <w:r>
-        <w:rPr>
-          <w:rFonts w:asciiTheme="majorBidi" w:hAnsiTheme="majorBidi" w:cstheme="majorBidi"/>
-          <w:sz w:val="28"/>
-          <w:szCs w:val="28"/>
-        </w:rPr>
-        <w:t xml:space="preserve"> with a Deployment:</w:t>
+        <w:t>For e</w:t>
+      </w:r>
+      <w:r>
+        <w:rPr>
+          <w:rFonts w:asciiTheme="majorBidi" w:hAnsiTheme="majorBidi" w:cstheme="majorBidi"/>
+          <w:sz w:val="28"/>
+          <w:szCs w:val="28"/>
+        </w:rPr>
+        <w:t>xample with a Deployment:</w:t>
       </w:r>
     </w:p>
     <w:p>
@@ -488,7 +458,7 @@
           <w:sz w:val="28"/>
           <w:szCs w:val="28"/>
         </w:rPr>
-        <w:t>If one Pod dies:</w:t>
+        <w:t>If one Pod dies</w:t>
       </w:r>
       <w:r>
         <w:rPr>
@@ -508,7 +478,23 @@
           <w:sz w:val="28"/>
           <w:szCs w:val="28"/>
         </w:rPr>
-        <w:t>3 → 2</w:t>
+        <w:t>(</w:t>
+      </w:r>
+      <w:r>
+        <w:rPr>
+          <w:rFonts w:asciiTheme="majorBidi" w:hAnsiTheme="majorBidi" w:cstheme="majorBidi"/>
+          <w:sz w:val="28"/>
+          <w:szCs w:val="28"/>
+        </w:rPr>
+        <w:t>3 →2</w:t>
+      </w:r>
+      <w:r>
+        <w:rPr>
+          <w:rFonts w:asciiTheme="majorBidi" w:hAnsiTheme="majorBidi" w:cstheme="majorBidi"/>
+          <w:sz w:val="28"/>
+          <w:szCs w:val="28"/>
+        </w:rPr>
+        <w:t>),</w:t>
       </w:r>
       <w:r>
         <w:rPr>
@@ -528,7 +514,7 @@
           <w:sz w:val="28"/>
           <w:szCs w:val="28"/>
         </w:rPr>
-        <w:t>The controller automatically creates a new Pod to return to:</w:t>
+        <w:t>The controller automatically creates a new Pod to return to</w:t>
       </w:r>
       <w:r>
         <w:rPr>
@@ -677,33 +663,15 @@
           <w:sz w:val="28"/>
           <w:szCs w:val="28"/>
         </w:rPr>
-        <w:t xml:space="preserve"> For </w:t>
-      </w:r>
-      <w:proofErr w:type="gramStart"/>
-      <w:r>
-        <w:rPr>
-          <w:rFonts w:asciiTheme="majorBidi" w:hAnsiTheme="majorBidi" w:cstheme="majorBidi"/>
-          <w:sz w:val="28"/>
-          <w:szCs w:val="28"/>
-        </w:rPr>
-        <w:t>e</w:t>
-      </w:r>
-      <w:r>
-        <w:rPr>
-          <w:rFonts w:asciiTheme="majorBidi" w:hAnsiTheme="majorBidi" w:cstheme="majorBidi"/>
-          <w:sz w:val="28"/>
-          <w:szCs w:val="28"/>
-        </w:rPr>
-        <w:t>xample</w:t>
-      </w:r>
-      <w:proofErr w:type="gramEnd"/>
-      <w:r>
-        <w:rPr>
-          <w:rFonts w:asciiTheme="majorBidi" w:hAnsiTheme="majorBidi" w:cstheme="majorBidi"/>
-          <w:sz w:val="28"/>
-          <w:szCs w:val="28"/>
-        </w:rPr>
-        <w:t xml:space="preserve"> with Deployment</w:t>
+        <w:t xml:space="preserve"> For e</w:t>
+      </w:r>
+      <w:r>
+        <w:rPr>
+          <w:rFonts w:asciiTheme="majorBidi" w:hAnsiTheme="majorBidi" w:cstheme="majorBidi"/>
+          <w:sz w:val="28"/>
+          <w:szCs w:val="28"/>
+        </w:rPr>
+        <w:t>xample with Deployment</w:t>
       </w:r>
       <w:r>
         <w:rPr>
@@ -870,7 +838,7 @@
           <w:sz w:val="28"/>
           <w:szCs w:val="28"/>
         </w:rPr>
-        <w:t>If you run an application directly in a Pod and want to change the container image:</w:t>
+        <w:t>If you run an application directly in a Pod and want to change the container image</w:t>
       </w:r>
       <w:r>
         <w:rPr>
@@ -879,6 +847,14 @@
           <w:szCs w:val="28"/>
         </w:rPr>
         <w:t xml:space="preserve"> </w:t>
+      </w:r>
+      <w:r>
+        <w:rPr>
+          <w:rFonts w:asciiTheme="majorBidi" w:hAnsiTheme="majorBidi" w:cstheme="majorBidi"/>
+          <w:sz w:val="28"/>
+          <w:szCs w:val="28"/>
+        </w:rPr>
+        <w:t>(</w:t>
       </w:r>
       <w:r>
         <w:rPr>
@@ -891,6 +867,14 @@
           <w:szCs w:val="28"/>
         </w:rPr>
         <w:t>nginx:1.24 → nginx:1.25</w:t>
+      </w:r>
+      <w:r>
+        <w:rPr>
+          <w:rFonts w:asciiTheme="majorBidi" w:hAnsiTheme="majorBidi" w:cstheme="majorBidi"/>
+          <w:sz w:val="28"/>
+          <w:szCs w:val="28"/>
+        </w:rPr>
+        <w:t>)</w:t>
       </w:r>
       <w:r>
         <w:rPr>
@@ -1709,9 +1693,9 @@
         <w:pStyle w:val="ListParagraph"/>
         <w:numPr>
           <w:ilvl w:val="0"/>
-          <w:numId w:val="3"/>
+          <w:numId w:val="10"/>
         </w:numPr>
-        <w:ind w:left="504"/>
+        <w:ind w:left="360"/>
         <w:jc w:val="both"/>
         <w:rPr>
           <w:rFonts w:asciiTheme="majorBidi" w:hAnsiTheme="majorBidi" w:cstheme="majorBidi"/>
@@ -1761,9 +1745,9 @@
         <w:pStyle w:val="ListParagraph"/>
         <w:numPr>
           <w:ilvl w:val="0"/>
-          <w:numId w:val="3"/>
+          <w:numId w:val="10"/>
         </w:numPr>
-        <w:ind w:left="504"/>
+        <w:ind w:left="360"/>
         <w:jc w:val="both"/>
         <w:rPr>
           <w:rFonts w:asciiTheme="majorBidi" w:hAnsiTheme="majorBidi" w:cstheme="majorBidi"/>
@@ -1821,9 +1805,9 @@
         <w:pStyle w:val="ListParagraph"/>
         <w:numPr>
           <w:ilvl w:val="0"/>
-          <w:numId w:val="3"/>
+          <w:numId w:val="10"/>
         </w:numPr>
-        <w:ind w:left="504"/>
+        <w:ind w:left="360"/>
         <w:jc w:val="both"/>
         <w:rPr>
           <w:rFonts w:asciiTheme="majorBidi" w:hAnsiTheme="majorBidi" w:cstheme="majorBidi"/>
@@ -1873,9 +1857,9 @@
         <w:pStyle w:val="ListParagraph"/>
         <w:numPr>
           <w:ilvl w:val="0"/>
-          <w:numId w:val="3"/>
+          <w:numId w:val="10"/>
         </w:numPr>
-        <w:ind w:left="504"/>
+        <w:ind w:left="360"/>
         <w:jc w:val="both"/>
         <w:rPr>
           <w:rFonts w:asciiTheme="majorBidi" w:hAnsiTheme="majorBidi" w:cstheme="majorBidi"/>
@@ -1923,9 +1907,9 @@
         <w:pStyle w:val="ListParagraph"/>
         <w:numPr>
           <w:ilvl w:val="0"/>
-          <w:numId w:val="3"/>
+          <w:numId w:val="10"/>
         </w:numPr>
-        <w:ind w:left="504"/>
+        <w:ind w:left="360"/>
         <w:jc w:val="both"/>
         <w:rPr>
           <w:rFonts w:asciiTheme="majorBidi" w:hAnsiTheme="majorBidi" w:cstheme="majorBidi"/>
@@ -1973,10 +1957,10 @@
         <w:pStyle w:val="ListParagraph"/>
         <w:numPr>
           <w:ilvl w:val="0"/>
-          <w:numId w:val="3"/>
+          <w:numId w:val="10"/>
         </w:numPr>
         <w:spacing w:after="60"/>
-        <w:ind w:left="504"/>
+        <w:ind w:left="360"/>
         <w:jc w:val="both"/>
         <w:rPr>
           <w:rFonts w:asciiTheme="majorBidi" w:hAnsiTheme="majorBidi" w:cstheme="majorBidi"/>
@@ -2077,6 +2061,7 @@
     </w:p>
     <w:p>
       <w:pPr>
+        <w:spacing w:after="60"/>
         <w:jc w:val="both"/>
         <w:rPr>
           <w:rFonts w:asciiTheme="majorBidi" w:hAnsiTheme="majorBidi" w:cstheme="majorBidi"/>
@@ -2108,7 +2093,7 @@
           <w:sz w:val="28"/>
           <w:szCs w:val="28"/>
         </w:rPr>
-        <w:t xml:space="preserve"> is a Kubernetes workload controller whose primary responsibility is to ensure that a specified number of identical Pods are running at all times. It continuously monitors the cluster and automatically creates or deletes Pods so that the actual number of running Pods </w:t>
+        <w:t xml:space="preserve"> is a Kubernetes workload controller whose primary responsibility is to ensure that a specified number of identical Pods are running at all times. It continuously monitors the </w:t>
       </w:r>
       <w:r>
         <w:rPr>
@@ -2117,7 +2102,7 @@
           <w:szCs w:val="28"/>
         </w:rPr>
         <w:lastRenderedPageBreak/>
-        <w:t xml:space="preserve">always matches the desired number declared by the user. </w:t>
+        <w:t xml:space="preserve">cluster and automatically creates or deletes Pods so that the actual number of running Pods always matches the desired number declared by the user. </w:t>
       </w:r>
       <w:proofErr w:type="spellStart"/>
       <w:r>
@@ -2324,7 +2309,7 @@
         <w:pStyle w:val="ListParagraph"/>
         <w:numPr>
           <w:ilvl w:val="0"/>
-          <w:numId w:val="4"/>
+          <w:numId w:val="11"/>
         </w:numPr>
         <w:ind w:left="360"/>
         <w:jc w:val="both"/>
@@ -2348,7 +2333,7 @@
         <w:pStyle w:val="ListParagraph"/>
         <w:numPr>
           <w:ilvl w:val="0"/>
-          <w:numId w:val="4"/>
+          <w:numId w:val="11"/>
         </w:numPr>
         <w:spacing w:after="60"/>
         <w:ind w:left="360"/>
@@ -2413,13 +2398,15 @@
           <w:rFonts w:asciiTheme="majorBidi" w:hAnsiTheme="majorBidi" w:cstheme="majorBidi"/>
           <w:sz w:val="28"/>
           <w:szCs w:val="28"/>
-        </w:rPr>
-      </w:pPr>
-      <w:r>
-        <w:rPr>
-          <w:rFonts w:asciiTheme="majorBidi" w:hAnsiTheme="majorBidi" w:cstheme="majorBidi"/>
-          <w:sz w:val="28"/>
-          <w:szCs w:val="28"/>
+          <w:u w:val="single"/>
+        </w:rPr>
+      </w:pPr>
+      <w:r>
+        <w:rPr>
+          <w:rFonts w:asciiTheme="majorBidi" w:hAnsiTheme="majorBidi" w:cstheme="majorBidi"/>
+          <w:sz w:val="28"/>
+          <w:szCs w:val="28"/>
+          <w:u w:val="single"/>
         </w:rPr>
         <w:t>Examples:</w:t>
       </w:r>
@@ -2429,7 +2416,7 @@
         <w:pStyle w:val="ListParagraph"/>
         <w:numPr>
           <w:ilvl w:val="0"/>
-          <w:numId w:val="5"/>
+          <w:numId w:val="12"/>
         </w:numPr>
         <w:ind w:left="360"/>
         <w:jc w:val="both"/>
@@ -2445,25 +2432,7 @@
           <w:sz w:val="28"/>
           <w:szCs w:val="28"/>
         </w:rPr>
-        <w:t xml:space="preserve">If a </w:t>
-      </w:r>
-      <w:proofErr w:type="gramStart"/>
-      <w:r>
-        <w:rPr>
-          <w:rFonts w:asciiTheme="majorBidi" w:hAnsiTheme="majorBidi" w:cstheme="majorBidi"/>
-          <w:sz w:val="28"/>
-          <w:szCs w:val="28"/>
-        </w:rPr>
-        <w:t>Pod crashes</w:t>
-      </w:r>
-      <w:proofErr w:type="gramEnd"/>
-      <w:r>
-        <w:rPr>
-          <w:rFonts w:asciiTheme="majorBidi" w:hAnsiTheme="majorBidi" w:cstheme="majorBidi"/>
-          <w:sz w:val="28"/>
-          <w:szCs w:val="28"/>
-        </w:rPr>
-        <w:t xml:space="preserve"> → </w:t>
+        <w:t xml:space="preserve">If a Pod crashes → </w:t>
       </w:r>
       <w:proofErr w:type="spellStart"/>
       <w:r>
@@ -2489,7 +2458,7 @@
         <w:pStyle w:val="ListParagraph"/>
         <w:numPr>
           <w:ilvl w:val="0"/>
-          <w:numId w:val="5"/>
+          <w:numId w:val="12"/>
         </w:numPr>
         <w:ind w:left="360"/>
         <w:jc w:val="both"/>
@@ -2531,7 +2500,7 @@
         <w:pStyle w:val="ListParagraph"/>
         <w:numPr>
           <w:ilvl w:val="0"/>
-          <w:numId w:val="5"/>
+          <w:numId w:val="12"/>
         </w:numPr>
         <w:ind w:left="360"/>
         <w:jc w:val="both"/>
@@ -2573,7 +2542,7 @@
         <w:pStyle w:val="ListParagraph"/>
         <w:numPr>
           <w:ilvl w:val="0"/>
-          <w:numId w:val="5"/>
+          <w:numId w:val="12"/>
         </w:numPr>
         <w:spacing w:after="60"/>
         <w:ind w:left="360"/>
@@ -2613,6 +2582,7 @@
     </w:p>
     <w:p>
       <w:pPr>
+        <w:spacing w:after="120"/>
         <w:jc w:val="both"/>
         <w:rPr>
           <w:rFonts w:asciiTheme="majorBidi" w:hAnsiTheme="majorBidi" w:cstheme="majorBidi"/>
@@ -2631,7 +2601,7 @@
     </w:p>
     <w:p>
       <w:pPr>
-        <w:spacing w:after="120"/>
+        <w:spacing w:after="60"/>
         <w:jc w:val="both"/>
         <w:rPr>
           <w:rFonts w:asciiTheme="majorBidi" w:hAnsiTheme="majorBidi" w:cstheme="majorBidi"/>
@@ -2716,7 +2686,7 @@
         <w:pStyle w:val="ListParagraph"/>
         <w:numPr>
           <w:ilvl w:val="0"/>
-          <w:numId w:val="6"/>
+          <w:numId w:val="13"/>
         </w:numPr>
         <w:spacing w:after="60"/>
         <w:ind w:left="360"/>
@@ -2772,6 +2742,7 @@
           <w:rFonts w:asciiTheme="majorBidi" w:hAnsiTheme="majorBidi" w:cstheme="majorBidi"/>
           <w:sz w:val="28"/>
           <w:szCs w:val="28"/>
+          <w:u w:val="single"/>
         </w:rPr>
         <w:t>Example:</w:t>
       </w:r>
@@ -2790,6 +2761,10 @@
       <w:r>
         <w:rPr>
           <w:rFonts w:asciiTheme="majorBidi" w:hAnsiTheme="majorBidi" w:cstheme="majorBidi"/>
+          <w:b/>
+          <w:bCs/>
+          <w:i/>
+          <w:iCs/>
           <w:sz w:val="28"/>
           <w:szCs w:val="28"/>
         </w:rPr>
@@ -2825,7 +2800,7 @@
         <w:pStyle w:val="ListParagraph"/>
         <w:numPr>
           <w:ilvl w:val="0"/>
-          <w:numId w:val="6"/>
+          <w:numId w:val="13"/>
         </w:numPr>
         <w:spacing w:after="60"/>
         <w:ind w:left="360"/>
@@ -2869,16 +2844,16 @@
         <mc:AlternateContent>
           <mc:Choice Requires="wps">
             <w:drawing>
-              <wp:anchor distT="0" distB="0" distL="114300" distR="114300" simplePos="0" relativeHeight="251659264" behindDoc="0" locked="0" layoutInCell="1" allowOverlap="1" wp14:anchorId="655290E8" wp14:editId="00B23113">
+              <wp:anchor distT="0" distB="0" distL="114300" distR="114300" simplePos="0" relativeHeight="251659264" behindDoc="0" locked="0" layoutInCell="1" allowOverlap="1" wp14:anchorId="655290E8" wp14:editId="055331C3">
                 <wp:simplePos x="0" y="0"/>
                 <wp:positionH relativeFrom="column">
-                  <wp:posOffset>219075</wp:posOffset>
+                  <wp:posOffset>220980</wp:posOffset>
                 </wp:positionH>
                 <wp:positionV relativeFrom="paragraph">
-                  <wp:posOffset>500379</wp:posOffset>
+                  <wp:posOffset>499745</wp:posOffset>
                 </wp:positionV>
-                <wp:extent cx="2286000" cy="771525"/>
-                <wp:effectExtent l="0" t="0" r="19050" b="28575"/>
+                <wp:extent cx="1424940" cy="792480"/>
+                <wp:effectExtent l="0" t="0" r="22860" b="26670"/>
                 <wp:wrapNone/>
                 <wp:docPr id="1792923778" name="Rectangle 1"/>
                 <wp:cNvGraphicFramePr/>
@@ -2889,7 +2864,7 @@
                       <wps:spPr>
                         <a:xfrm>
                           <a:off x="0" y="0"/>
-                          <a:ext cx="2286000" cy="771525"/>
+                          <a:ext cx="1424940" cy="792480"/>
                         </a:xfrm>
                         <a:prstGeom prst="rect">
                           <a:avLst/>
@@ -3045,7 +3020,7 @@
           </mc:Choice>
           <mc:Fallback>
             <w:pict>
-              <v:rect w14:anchorId="655290E8" id="Rectangle 1" o:spid="_x0000_s1026" style="position:absolute;left:0;text-align:left;margin-left:17.25pt;margin-top:39.4pt;width:180pt;height:60.75pt;z-index:251659264;visibility:visible;mso-wrap-style:square;mso-width-percent:0;mso-height-percent:0;mso-wrap-distance-left:9pt;mso-wrap-distance-top:0;mso-wrap-distance-right:9pt;mso-wrap-distance-bottom:0;mso-position-horizontal:absolute;mso-position-horizontal-relative:text;mso-position-vertical:absolute;mso-position-vertical-relative:text;mso-width-percent:0;mso-height-percent:0;mso-width-relative:margin;mso-height-relative:margin;v-text-anchor:middle" o:gfxdata="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" fillcolor="black [3200]" strokecolor="black [480]" strokeweight="1pt">
+              <v:rect w14:anchorId="655290E8" id="Rectangle 1" o:spid="_x0000_s1026" style="position:absolute;left:0;text-align:left;margin-left:17.4pt;margin-top:39.35pt;width:112.2pt;height:62.4pt;z-index:251659264;visibility:visible;mso-wrap-style:square;mso-width-percent:0;mso-height-percent:0;mso-wrap-distance-left:9pt;mso-wrap-distance-top:0;mso-wrap-distance-right:9pt;mso-wrap-distance-bottom:0;mso-position-horizontal:absolute;mso-position-horizontal-relative:text;mso-position-vertical:absolute;mso-position-vertical-relative:text;mso-width-percent:0;mso-height-percent:0;mso-width-relative:margin;mso-height-relative:margin;v-text-anchor:middle" o:gfxdata="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" fillcolor="black [3200]" strokecolor="black [480]" strokeweight="1pt">
                 <v:textbox>
                   <w:txbxContent>
                     <w:p>
@@ -3204,6 +3179,7 @@
           <w:rFonts w:asciiTheme="majorBidi" w:hAnsiTheme="majorBidi" w:cstheme="majorBidi"/>
           <w:sz w:val="28"/>
           <w:szCs w:val="28"/>
+          <w:u w:val="single"/>
         </w:rPr>
         <w:t>Example:</w:t>
       </w:r>
@@ -3225,8 +3201,8 @@
         <w:jc w:val="both"/>
         <w:rPr>
           <w:rFonts w:asciiTheme="majorBidi" w:hAnsiTheme="majorBidi" w:cstheme="majorBidi"/>
-          <w:sz w:val="28"/>
-          <w:szCs w:val="28"/>
+          <w:sz w:val="32"/>
+          <w:szCs w:val="32"/>
         </w:rPr>
       </w:pPr>
     </w:p>
@@ -3343,7 +3319,7 @@
         <w:pStyle w:val="ListParagraph"/>
         <w:numPr>
           <w:ilvl w:val="0"/>
-          <w:numId w:val="6"/>
+          <w:numId w:val="13"/>
         </w:numPr>
         <w:spacing w:after="60"/>
         <w:ind w:left="360"/>
@@ -3365,41 +3341,6 @@
           <w:szCs w:val="28"/>
         </w:rPr>
         <w:t>Pod Template</w:t>
-      </w:r>
-    </w:p>
-    <w:p>
-      <w:pPr>
-        <w:ind w:left="360"/>
-        <w:jc w:val="both"/>
-        <w:rPr>
-          <w:rFonts w:asciiTheme="majorBidi" w:hAnsiTheme="majorBidi" w:cstheme="majorBidi"/>
-          <w:sz w:val="28"/>
-          <w:szCs w:val="28"/>
-        </w:rPr>
-      </w:pPr>
-      <w:r>
-        <w:rPr>
-          <w:rFonts w:asciiTheme="majorBidi" w:hAnsiTheme="majorBidi" w:cstheme="majorBidi"/>
-          <w:sz w:val="28"/>
-          <w:szCs w:val="28"/>
-        </w:rPr>
-        <w:t>The Pod template defines how new Pods should be created.</w:t>
-      </w:r>
-      <w:r>
-        <w:rPr>
-          <w:rFonts w:asciiTheme="majorBidi" w:hAnsiTheme="majorBidi" w:cstheme="majorBidi"/>
-          <w:sz w:val="28"/>
-          <w:szCs w:val="28"/>
-        </w:rPr>
-        <w:t xml:space="preserve"> </w:t>
-      </w:r>
-      <w:r>
-        <w:rPr>
-          <w:rFonts w:asciiTheme="majorBidi" w:hAnsiTheme="majorBidi" w:cstheme="majorBidi"/>
-          <w:sz w:val="28"/>
-          <w:szCs w:val="28"/>
-        </w:rPr>
-        <w:t>Example:</w:t>
       </w:r>
     </w:p>
     <w:p>
@@ -3423,16 +3364,16 @@
         <mc:AlternateContent>
           <mc:Choice Requires="wps">
             <w:drawing>
-              <wp:anchor distT="0" distB="0" distL="114300" distR="114300" simplePos="0" relativeHeight="251660288" behindDoc="0" locked="0" layoutInCell="1" allowOverlap="1" wp14:anchorId="42699DD1" wp14:editId="3109DCC4">
+              <wp:anchor distT="0" distB="0" distL="114300" distR="114300" simplePos="0" relativeHeight="251660288" behindDoc="0" locked="0" layoutInCell="1" allowOverlap="1" wp14:anchorId="42699DD1" wp14:editId="2D2C4612">
                 <wp:simplePos x="0" y="0"/>
                 <wp:positionH relativeFrom="column">
-                  <wp:posOffset>219075</wp:posOffset>
+                  <wp:posOffset>220980</wp:posOffset>
                 </wp:positionH>
                 <wp:positionV relativeFrom="paragraph">
-                  <wp:posOffset>1</wp:posOffset>
+                  <wp:posOffset>297180</wp:posOffset>
                 </wp:positionV>
-                <wp:extent cx="3345180" cy="1981200"/>
-                <wp:effectExtent l="0" t="0" r="26670" b="19050"/>
+                <wp:extent cx="2225040" cy="1988820"/>
+                <wp:effectExtent l="0" t="0" r="22860" b="11430"/>
                 <wp:wrapNone/>
                 <wp:docPr id="1521008993" name="Rectangle 2"/>
                 <wp:cNvGraphicFramePr/>
@@ -3443,7 +3384,7 @@
                       <wps:spPr>
                         <a:xfrm>
                           <a:off x="0" y="0"/>
-                          <a:ext cx="3345180" cy="1981200"/>
+                          <a:ext cx="2225040" cy="1988820"/>
                         </a:xfrm>
                         <a:prstGeom prst="rect">
                           <a:avLst/>
@@ -3787,7 +3728,7 @@
           </mc:Choice>
           <mc:Fallback>
             <w:pict>
-              <v:rect w14:anchorId="42699DD1" id="Rectangle 2" o:spid="_x0000_s1027" style="position:absolute;left:0;text-align:left;margin-left:17.25pt;margin-top:0;width:263.4pt;height:156pt;z-index:251660288;visibility:visible;mso-wrap-style:square;mso-width-percent:0;mso-height-percent:0;mso-wrap-distance-left:9pt;mso-wrap-distance-top:0;mso-wrap-distance-right:9pt;mso-wrap-distance-bottom:0;mso-position-horizontal:absolute;mso-position-horizontal-relative:text;mso-position-vertical:absolute;mso-position-vertical-relative:text;mso-width-percent:0;mso-height-percent:0;mso-width-relative:margin;mso-height-relative:margin;v-text-anchor:middle" o:gfxdata="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" fillcolor="black [3200]" strokecolor="black [480]" strokeweight="1pt">
+              <v:rect w14:anchorId="42699DD1" id="Rectangle 2" o:spid="_x0000_s1027" style="position:absolute;left:0;text-align:left;margin-left:17.4pt;margin-top:23.4pt;width:175.2pt;height:156.6pt;z-index:251660288;visibility:visible;mso-wrap-style:square;mso-width-percent:0;mso-height-percent:0;mso-wrap-distance-left:9pt;mso-wrap-distance-top:0;mso-wrap-distance-right:9pt;mso-wrap-distance-bottom:0;mso-position-horizontal:absolute;mso-position-horizontal-relative:text;mso-position-vertical:absolute;mso-position-vertical-relative:text;mso-width-percent:0;mso-height-percent:0;mso-width-relative:margin;mso-height-relative:margin;v-text-anchor:middle" o:gfxdata="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" fillcolor="black [3200]" strokecolor="black [480]" strokeweight="1pt">
                 <v:textbox>
                   <w:txbxContent>
                     <w:p>
@@ -4095,6 +4036,31 @@
           </mc:Fallback>
         </mc:AlternateContent>
       </w:r>
+      <w:r>
+        <w:rPr>
+          <w:rFonts w:asciiTheme="majorBidi" w:hAnsiTheme="majorBidi" w:cstheme="majorBidi"/>
+          <w:sz w:val="28"/>
+          <w:szCs w:val="28"/>
+        </w:rPr>
+        <w:t>The Pod template defines how new Pods should be created.</w:t>
+      </w:r>
+      <w:r>
+        <w:rPr>
+          <w:rFonts w:asciiTheme="majorBidi" w:hAnsiTheme="majorBidi" w:cstheme="majorBidi"/>
+          <w:sz w:val="28"/>
+          <w:szCs w:val="28"/>
+        </w:rPr>
+        <w:t xml:space="preserve"> </w:t>
+      </w:r>
+      <w:r>
+        <w:rPr>
+          <w:rFonts w:asciiTheme="majorBidi" w:hAnsiTheme="majorBidi" w:cstheme="majorBidi"/>
+          <w:sz w:val="28"/>
+          <w:szCs w:val="28"/>
+          <w:u w:val="single"/>
+        </w:rPr>
+        <w:t>Example:</w:t>
+      </w:r>
     </w:p>
     <w:p>
       <w:pPr>
@@ -4148,6 +4114,15 @@
           <w:rFonts w:asciiTheme="majorBidi" w:hAnsiTheme="majorBidi" w:cstheme="majorBidi"/>
           <w:sz w:val="28"/>
           <w:szCs w:val="28"/>
+        </w:rPr>
+      </w:pPr>
+    </w:p>
+    <w:p>
+      <w:pPr>
+        <w:ind w:left="360"/>
+        <w:jc w:val="both"/>
+        <w:rPr>
+          <w:rFonts w:asciiTheme="majorBidi" w:hAnsiTheme="majorBidi" w:cstheme="majorBidi"/>
         </w:rPr>
       </w:pPr>
     </w:p>
@@ -4272,7 +4247,7 @@
           <w:sz w:val="28"/>
           <w:szCs w:val="28"/>
         </w:rPr>
-        <w:t xml:space="preserve"> controller operates through the Kubernetes control plane:</w:t>
+        <w:t xml:space="preserve"> controller operates through the Kubernetes control plane</w:t>
       </w:r>
     </w:p>
     <w:p>
@@ -4320,6 +4295,8 @@
       <w:r>
         <w:rPr>
           <w:rFonts w:asciiTheme="majorBidi" w:hAnsiTheme="majorBidi" w:cstheme="majorBidi"/>
+          <w:b/>
+          <w:bCs/>
           <w:sz w:val="28"/>
           <w:szCs w:val="28"/>
         </w:rPr>
@@ -4520,13 +4497,15 @@
           <w:rFonts w:asciiTheme="majorBidi" w:hAnsiTheme="majorBidi" w:cstheme="majorBidi"/>
           <w:sz w:val="28"/>
           <w:szCs w:val="28"/>
-        </w:rPr>
-      </w:pPr>
-      <w:r>
-        <w:rPr>
-          <w:rFonts w:asciiTheme="majorBidi" w:hAnsiTheme="majorBidi" w:cstheme="majorBidi"/>
-          <w:sz w:val="28"/>
-          <w:szCs w:val="28"/>
+          <w:u w:val="single"/>
+        </w:rPr>
+      </w:pPr>
+      <w:r>
+        <w:rPr>
+          <w:rFonts w:asciiTheme="majorBidi" w:hAnsiTheme="majorBidi" w:cstheme="majorBidi"/>
+          <w:sz w:val="28"/>
+          <w:szCs w:val="28"/>
+          <w:u w:val="single"/>
         </w:rPr>
         <w:t>Example scenario:</w:t>
       </w:r>
@@ -4552,7 +4531,19 @@
           <w:sz w:val="28"/>
           <w:szCs w:val="28"/>
         </w:rPr>
-        <w:t>Desired replicas: 3</w:t>
+        <w:t xml:space="preserve">Desired </w:t>
+      </w:r>
+      <w:r>
+        <w:rPr>
+          <w:rFonts w:asciiTheme="majorBidi" w:hAnsiTheme="majorBidi" w:cstheme="majorBidi"/>
+          <w:b/>
+          <w:bCs/>
+          <w:i/>
+          <w:iCs/>
+          <w:sz w:val="28"/>
+          <w:szCs w:val="28"/>
+        </w:rPr>
+        <w:t>replicas: 3</w:t>
       </w:r>
     </w:p>
     <w:p>
@@ -4600,7 +4591,19 @@
           <w:sz w:val="28"/>
           <w:szCs w:val="28"/>
         </w:rPr>
-        <w:t>Actual replicas: 2</w:t>
+        <w:t xml:space="preserve">Actual </w:t>
+      </w:r>
+      <w:r>
+        <w:rPr>
+          <w:rFonts w:asciiTheme="majorBidi" w:hAnsiTheme="majorBidi" w:cstheme="majorBidi"/>
+          <w:b/>
+          <w:bCs/>
+          <w:i/>
+          <w:iCs/>
+          <w:sz w:val="28"/>
+          <w:szCs w:val="28"/>
+        </w:rPr>
+        <w:t>replicas: 2</w:t>
       </w:r>
     </w:p>
     <w:p>
@@ -4737,6 +4740,7 @@
           <w:rFonts w:asciiTheme="majorBidi" w:hAnsiTheme="majorBidi" w:cstheme="majorBidi"/>
           <w:sz w:val="28"/>
           <w:szCs w:val="28"/>
+          <w:u w:val="single"/>
         </w:rPr>
       </w:pPr>
       <w:proofErr w:type="spellStart"/>
@@ -4770,6 +4774,7 @@
           <w:rFonts w:asciiTheme="majorBidi" w:hAnsiTheme="majorBidi" w:cstheme="majorBidi"/>
           <w:sz w:val="28"/>
           <w:szCs w:val="28"/>
+          <w:u w:val="single"/>
         </w:rPr>
         <w:t>Example:</w:t>
       </w:r>
@@ -5061,7 +5066,7 @@
         <w:pStyle w:val="ListParagraph"/>
         <w:numPr>
           <w:ilvl w:val="0"/>
-          <w:numId w:val="6"/>
+          <w:numId w:val="13"/>
         </w:numPr>
         <w:ind w:left="360"/>
         <w:jc w:val="both"/>
@@ -5085,7 +5090,7 @@
         <w:pStyle w:val="ListParagraph"/>
         <w:numPr>
           <w:ilvl w:val="0"/>
-          <w:numId w:val="6"/>
+          <w:numId w:val="13"/>
         </w:numPr>
         <w:ind w:left="360"/>
         <w:jc w:val="both"/>
@@ -5101,6 +5106,7 @@
           <w:sz w:val="28"/>
           <w:szCs w:val="28"/>
         </w:rPr>
+        <w:lastRenderedPageBreak/>
         <w:t>No rollback support</w:t>
       </w:r>
     </w:p>
@@ -5109,7 +5115,7 @@
         <w:pStyle w:val="ListParagraph"/>
         <w:numPr>
           <w:ilvl w:val="0"/>
-          <w:numId w:val="6"/>
+          <w:numId w:val="13"/>
         </w:numPr>
         <w:ind w:left="360"/>
         <w:jc w:val="both"/>
@@ -5125,7 +5131,6 @@
           <w:sz w:val="28"/>
           <w:szCs w:val="28"/>
         </w:rPr>
-        <w:lastRenderedPageBreak/>
         <w:t>No revision history</w:t>
       </w:r>
     </w:p>
@@ -5134,7 +5139,7 @@
         <w:pStyle w:val="ListParagraph"/>
         <w:numPr>
           <w:ilvl w:val="0"/>
-          <w:numId w:val="6"/>
+          <w:numId w:val="13"/>
         </w:numPr>
         <w:spacing w:after="60"/>
         <w:ind w:left="360"/>
@@ -5371,7 +5376,7 @@
         <w:pStyle w:val="ListParagraph"/>
         <w:numPr>
           <w:ilvl w:val="0"/>
-          <w:numId w:val="9"/>
+          <w:numId w:val="14"/>
         </w:numPr>
         <w:ind w:left="360"/>
         <w:jc w:val="both"/>
@@ -5413,7 +5418,7 @@
         <w:pStyle w:val="ListParagraph"/>
         <w:numPr>
           <w:ilvl w:val="0"/>
-          <w:numId w:val="9"/>
+          <w:numId w:val="14"/>
         </w:numPr>
         <w:ind w:left="360"/>
         <w:jc w:val="both"/>
@@ -5455,7 +5460,7 @@
         <w:pStyle w:val="ListParagraph"/>
         <w:numPr>
           <w:ilvl w:val="0"/>
-          <w:numId w:val="9"/>
+          <w:numId w:val="14"/>
         </w:numPr>
         <w:spacing w:after="120"/>
         <w:ind w:left="360"/>
@@ -5580,7 +5585,7 @@
         <w:pStyle w:val="ListParagraph"/>
         <w:numPr>
           <w:ilvl w:val="0"/>
-          <w:numId w:val="9"/>
+          <w:numId w:val="15"/>
         </w:numPr>
         <w:ind w:left="360"/>
         <w:jc w:val="both"/>
@@ -5604,7 +5609,7 @@
         <w:pStyle w:val="ListParagraph"/>
         <w:numPr>
           <w:ilvl w:val="0"/>
-          <w:numId w:val="9"/>
+          <w:numId w:val="15"/>
         </w:numPr>
         <w:ind w:left="360"/>
         <w:jc w:val="both"/>
@@ -5628,7 +5633,7 @@
         <w:pStyle w:val="ListParagraph"/>
         <w:numPr>
           <w:ilvl w:val="0"/>
-          <w:numId w:val="9"/>
+          <w:numId w:val="15"/>
         </w:numPr>
         <w:spacing w:after="60"/>
         <w:ind w:left="360"/>
@@ -5889,7 +5894,7 @@
           <w:sz w:val="28"/>
           <w:szCs w:val="28"/>
         </w:rPr>
-        <w:t xml:space="preserve"> had limitations when it came to application lifecycle management. While they could maintain the number of Pods, they did not provide advanced features required for safe application updates. For example, performing rolling updates, managing rollbacks to previous versions, or controlling update </w:t>
+        <w:t xml:space="preserve"> had limitations when it came to application lifecycle management. While they could maintain the number of Pods, they did not provide advanced features required for safe application updates. For example, </w:t>
       </w:r>
       <w:r>
         <w:rPr>
@@ -5898,7 +5903,7 @@
           <w:szCs w:val="28"/>
         </w:rPr>
         <w:lastRenderedPageBreak/>
-        <w:t>history were not handled directly by these controllers. These operational tasks became increasingly important as Kubernetes began to be used for production workloads.</w:t>
+        <w:t>performing rolling updates, managing rollbacks to previous versions, or controlling update history were not handled directly by these controllers. These operational tasks became increasingly important as Kubernetes began to be used for production workloads.</w:t>
       </w:r>
     </w:p>
     <w:p>
@@ -5953,7 +5958,31 @@
           <w:sz w:val="28"/>
           <w:szCs w:val="28"/>
         </w:rPr>
-        <w:t xml:space="preserve">—such as maintaining the desired number of Pods and enabling scaling—are still used, but the Deployment adds important features like rolling updates, versioned rollbacks, and better control over application updates. When a Deployment is updated, Kubernetes creates a new </w:t>
+        <w:t xml:space="preserve"> </w:t>
+      </w:r>
+      <w:r>
+        <w:rPr>
+          <w:rFonts w:asciiTheme="majorBidi" w:hAnsiTheme="majorBidi" w:cstheme="majorBidi"/>
+          <w:sz w:val="28"/>
+          <w:szCs w:val="28"/>
+        </w:rPr>
+        <w:t>such as maintaining the desired number of Pods and enabling scaling</w:t>
+      </w:r>
+      <w:r>
+        <w:rPr>
+          <w:rFonts w:asciiTheme="majorBidi" w:hAnsiTheme="majorBidi" w:cstheme="majorBidi"/>
+          <w:sz w:val="28"/>
+          <w:szCs w:val="28"/>
+        </w:rPr>
+        <w:t xml:space="preserve">, </w:t>
+      </w:r>
+      <w:r>
+        <w:rPr>
+          <w:rFonts w:asciiTheme="majorBidi" w:hAnsiTheme="majorBidi" w:cstheme="majorBidi"/>
+          <w:sz w:val="28"/>
+          <w:szCs w:val="28"/>
+        </w:rPr>
+        <w:t xml:space="preserve">are still used, but the Deployment adds important features like rolling updates, versioned rollbacks, and better control over application updates. When a Deployment is updated, Kubernetes creates a new </w:t>
       </w:r>
       <w:proofErr w:type="spellStart"/>
       <w:r>
@@ -6084,7 +6113,7 @@
 </file>
 
 <file path=word/numbering.xml><?xml version="1.0" encoding="utf-8"?>
-<w:numbering xmlns:wpc="http://schemas.microsoft.com/office/word/2010/wordprocessingCanvas" xmlns:cx="http://schemas.microsoft.com/office/drawing/2014/chartex" xmlns:cx1="http://schemas.microsoft.com/office/drawing/2015/9/8/chartex" xmlns:cx2="http://schemas.microsoft.com/office/drawing/2015/10/21/chartex" xmlns:cx3="http://schemas.microsoft.com/office/drawing/2016/5/9/chartex" xmlns:cx4="http://schemas.microsoft.com/office/drawing/2016/5/10/chartex" xmlns:cx5="http://schemas.microsoft.com/office/drawing/2016/5/11/chartex" xmlns:cx6="http://schemas.microsoft.com/office/drawing/2016/5/12/chartex" xmlns:cx7="http://schemas.microsoft.com/office/drawing/2016/5/13/chartex" xmlns:cx8="http://schemas.microsoft.com/office/drawing/2016/5/14/chartex" xmlns:mc="http://schemas.openxmlformats.org/markup-compatibility/2006" xmlns:aink="http://schemas.microsoft.com/office/drawing/2016/ink" xmlns:am3d="http://schemas.microsoft.com/office/drawing/2017/model3d" xmlns:o="urn:schemas-microsoft-com:office:office" xmlns:oel="http://schemas.microsoft.com/office/2019/extlst" xmlns:r="http://schemas.openxmlformats.org/officeDocument/2006/relationships" xmlns:m="http://schemas.openxmlformats.org/officeDocument/2006/math" xmlns:v="urn:schemas-microsoft-com:vml" xmlns:wp14="http://schemas.microsoft.com/office/word/2010/wordprocessingDrawing" xmlns:wp="http://schemas.openxmlformats.org/drawingml/2006/wordprocessingDrawing" xmlns:w10="urn:schemas-microsoft-com:office:word" xmlns:w="http://schemas.openxmlformats.org/wordprocessingml/2006/main" xmlns:w14="http://schemas.microsoft.com/office/word/2010/wordml" xmlns:w15="http://schemas.microsoft.com/office/word/2012/wordml" xmlns:w16cex="http://schemas.microsoft.com/office/word/2018/wordml/cex" xmlns:w16cid="http://schemas.microsoft.com/office/word/2016/wordml/cid" xmlns:w16="http://schemas.microsoft.com/office/word/2018/wordml" xmlns:w16sdtdh="http://schemas.microsoft.com/office/word/2020/wordml/sdtdatahash" xmlns:w16se="http://schemas.microsoft.com/office/word/2015/wordml/symex" xmlns:wpg="http://schemas.microsoft.com/office/word/2010/wordprocessingGroup" xmlns:wpi="http://schemas.microsoft.com/office/word/2010/wordprocessingInk" xmlns:wne="http://schemas.microsoft.com/office/word/2006/wordml" xmlns:wps="http://schemas.microsoft.com/office/word/2010/wordprocessingShape" mc:Ignorable="w14 w15 w16se w16cid w16 w16cex w16sdtdh wp14">
+<w:numbering xmlns:wpc="http://schemas.microsoft.com/office/word/2010/wordprocessingCanvas" xmlns:cx="http://schemas.microsoft.com/office/drawing/2014/chartex" xmlns:cx1="http://schemas.microsoft.com/office/drawing/2015/9/8/chartex" xmlns:cx2="http://schemas.microsoft.com/office/drawing/2015/10/21/chartex" xmlns:cx3="http://schemas.microsoft.com/office/drawing/2016/5/9/chartex" xmlns:cx4="http://schemas.microsoft.com/office/drawing/2016/5/10/chartex" xmlns:cx5="http://schemas.microsoft.com/office/drawing/2016/5/11/chartex" xmlns:cx6="http://schemas.microsoft.com/office/drawing/2016/5/12/chartex" xmlns:cx7="http://schemas.microsoft.com/office/drawing/2016/5/13/chartex" xmlns:cx8="http://schemas.microsoft.com/office/drawing/2016/5/14/chartex" xmlns:mc="http://schemas.openxmlformats.org/markup-compatibility/2006" xmlns:aink="http://schemas.microsoft.com/office/drawing/2016/ink" xmlns:am3d="http://schemas.microsoft.com/office/drawing/2017/model3d" xmlns:o="urn:schemas-microsoft-com:office:office" xmlns:oel="http://schemas.microsoft.com/office/2019/extlst" xmlns:r="http://schemas.openxmlformats.org/officeDocument/2006/relationships" xmlns:m="http://schemas.openxmlformats.org/officeDocument/2006/math" xmlns:v="urn:schemas-microsoft-com:vml" xmlns:wp14="http://schemas.microsoft.com/office/word/2010/wordprocessingDrawing" xmlns:wp="http://schemas.openxmlformats.org/drawingml/2006/wordprocessingDrawing" xmlns:w10="urn:schemas-microsoft-com:office:word" xmlns:w="http://schemas.openxmlformats.org/wordprocessingml/2006/main" xmlns:w14="http://schemas.microsoft.com/office/word/2010/wordml" xmlns:w15="http://schemas.microsoft.com/office/word/2012/wordml" xmlns:w16cex="http://schemas.microsoft.com/office/word/2018/wordml/cex" xmlns:w16cid="http://schemas.microsoft.com/office/word/2016/wordml/cid" xmlns:w16="http://schemas.microsoft.com/office/word/2018/wordml" xmlns:w16du="http://schemas.microsoft.com/office/word/2023/wordml/word16du" xmlns:w16sdtdh="http://schemas.microsoft.com/office/word/2020/wordml/sdtdatahash" xmlns:w16sdtfl="http://schemas.microsoft.com/office/word/2024/wordml/sdtformatlock" xmlns:w16se="http://schemas.microsoft.com/office/word/2015/wordml/symex" xmlns:wpg="http://schemas.microsoft.com/office/word/2010/wordprocessingGroup" xmlns:wpi="http://schemas.microsoft.com/office/word/2010/wordprocessingInk" xmlns:wne="http://schemas.microsoft.com/office/word/2006/wordml" xmlns:wps="http://schemas.microsoft.com/office/word/2010/wordprocessingShape" mc:Ignorable="w14 w15 w16se w16cid w16 w16cex w16sdtdh w16sdtfl w16du wp14">
   <w:abstractNum w:abstractNumId="0" w15:restartNumberingAfterBreak="0">
     <w:nsid w:val="048F0AFE"/>
     <w:multiLevelType w:val="hybridMultilevel"/>
@@ -6594,6 +6623,345 @@
     </w:lvl>
   </w:abstractNum>
   <w:abstractNum w:abstractNumId="5" w15:restartNumberingAfterBreak="0">
+    <w:nsid w:val="3AF749A2"/>
+    <w:multiLevelType w:val="hybridMultilevel"/>
+    <w:tmpl w:val="31DADACA"/>
+    <w:lvl w:ilvl="0" w:tplc="04090001">
+      <w:start w:val="1"/>
+      <w:numFmt w:val="bullet"/>
+      <w:lvlText w:val=""/>
+      <w:lvlJc w:val="left"/>
+      <w:pPr>
+        <w:ind w:left="720" w:hanging="360"/>
+      </w:pPr>
+      <w:rPr>
+        <w:rFonts w:ascii="Symbol" w:hAnsi="Symbol" w:hint="default"/>
+      </w:rPr>
+    </w:lvl>
+    <w:lvl w:ilvl="1" w:tplc="04090003" w:tentative="1">
+      <w:start w:val="1"/>
+      <w:numFmt w:val="bullet"/>
+      <w:lvlText w:val="o"/>
+      <w:lvlJc w:val="left"/>
+      <w:pPr>
+        <w:ind w:left="1440" w:hanging="360"/>
+      </w:pPr>
+      <w:rPr>
+        <w:rFonts w:ascii="Courier New" w:hAnsi="Courier New" w:cs="Courier New" w:hint="default"/>
+      </w:rPr>
+    </w:lvl>
+    <w:lvl w:ilvl="2" w:tplc="04090005" w:tentative="1">
+      <w:start w:val="1"/>
+      <w:numFmt w:val="bullet"/>
+      <w:lvlText w:val=""/>
+      <w:lvlJc w:val="left"/>
+      <w:pPr>
+        <w:ind w:left="2160" w:hanging="360"/>
+      </w:pPr>
+      <w:rPr>
+        <w:rFonts w:ascii="Wingdings" w:hAnsi="Wingdings" w:hint="default"/>
+      </w:rPr>
+    </w:lvl>
+    <w:lvl w:ilvl="3" w:tplc="04090001" w:tentative="1">
+      <w:start w:val="1"/>
+      <w:numFmt w:val="bullet"/>
+      <w:lvlText w:val=""/>
+      <w:lvlJc w:val="left"/>
+      <w:pPr>
+        <w:ind w:left="2880" w:hanging="360"/>
+      </w:pPr>
+      <w:rPr>
+        <w:rFonts w:ascii="Symbol" w:hAnsi="Symbol" w:hint="default"/>
+      </w:rPr>
+    </w:lvl>
+    <w:lvl w:ilvl="4" w:tplc="04090003" w:tentative="1">
+      <w:start w:val="1"/>
+      <w:numFmt w:val="bullet"/>
+      <w:lvlText w:val="o"/>
+      <w:lvlJc w:val="left"/>
+      <w:pPr>
+        <w:ind w:left="3600" w:hanging="360"/>
+      </w:pPr>
+      <w:rPr>
+        <w:rFonts w:ascii="Courier New" w:hAnsi="Courier New" w:cs="Courier New" w:hint="default"/>
+      </w:rPr>
+    </w:lvl>
+    <w:lvl w:ilvl="5" w:tplc="04090005" w:tentative="1">
+      <w:start w:val="1"/>
+      <w:numFmt w:val="bullet"/>
+      <w:lvlText w:val=""/>
+      <w:lvlJc w:val="left"/>
+      <w:pPr>
+        <w:ind w:left="4320" w:hanging="360"/>
+      </w:pPr>
+      <w:rPr>
+        <w:rFonts w:ascii="Wingdings" w:hAnsi="Wingdings" w:hint="default"/>
+      </w:rPr>
+    </w:lvl>
+    <w:lvl w:ilvl="6" w:tplc="04090001" w:tentative="1">
+      <w:start w:val="1"/>
+      <w:numFmt w:val="bullet"/>
+      <w:lvlText w:val=""/>
+      <w:lvlJc w:val="left"/>
+      <w:pPr>
+        <w:ind w:left="5040" w:hanging="360"/>
+      </w:pPr>
+      <w:rPr>
+        <w:rFonts w:ascii="Symbol" w:hAnsi="Symbol" w:hint="default"/>
+      </w:rPr>
+    </w:lvl>
+    <w:lvl w:ilvl="7" w:tplc="04090003" w:tentative="1">
+      <w:start w:val="1"/>
+      <w:numFmt w:val="bullet"/>
+      <w:lvlText w:val="o"/>
+      <w:lvlJc w:val="left"/>
+      <w:pPr>
+        <w:ind w:left="5760" w:hanging="360"/>
+      </w:pPr>
+      <w:rPr>
+        <w:rFonts w:ascii="Courier New" w:hAnsi="Courier New" w:cs="Courier New" w:hint="default"/>
+      </w:rPr>
+    </w:lvl>
+    <w:lvl w:ilvl="8" w:tplc="04090005" w:tentative="1">
+      <w:start w:val="1"/>
+      <w:numFmt w:val="bullet"/>
+      <w:lvlText w:val=""/>
+      <w:lvlJc w:val="left"/>
+      <w:pPr>
+        <w:ind w:left="6480" w:hanging="360"/>
+      </w:pPr>
+      <w:rPr>
+        <w:rFonts w:ascii="Wingdings" w:hAnsi="Wingdings" w:hint="default"/>
+      </w:rPr>
+    </w:lvl>
+  </w:abstractNum>
+  <w:abstractNum w:abstractNumId="6" w15:restartNumberingAfterBreak="0">
+    <w:nsid w:val="466F6405"/>
+    <w:multiLevelType w:val="hybridMultilevel"/>
+    <w:tmpl w:val="9B6ACCA8"/>
+    <w:lvl w:ilvl="0" w:tplc="04090001">
+      <w:start w:val="1"/>
+      <w:numFmt w:val="bullet"/>
+      <w:lvlText w:val=""/>
+      <w:lvlJc w:val="left"/>
+      <w:pPr>
+        <w:ind w:left="720" w:hanging="360"/>
+      </w:pPr>
+      <w:rPr>
+        <w:rFonts w:ascii="Symbol" w:hAnsi="Symbol" w:hint="default"/>
+      </w:rPr>
+    </w:lvl>
+    <w:lvl w:ilvl="1" w:tplc="04090003" w:tentative="1">
+      <w:start w:val="1"/>
+      <w:numFmt w:val="bullet"/>
+      <w:lvlText w:val="o"/>
+      <w:lvlJc w:val="left"/>
+      <w:pPr>
+        <w:ind w:left="1440" w:hanging="360"/>
+      </w:pPr>
+      <w:rPr>
+        <w:rFonts w:ascii="Courier New" w:hAnsi="Courier New" w:cs="Courier New" w:hint="default"/>
+      </w:rPr>
+    </w:lvl>
+    <w:lvl w:ilvl="2" w:tplc="04090005" w:tentative="1">
+      <w:start w:val="1"/>
+      <w:numFmt w:val="bullet"/>
+      <w:lvlText w:val=""/>
+      <w:lvlJc w:val="left"/>
+      <w:pPr>
+        <w:ind w:left="2160" w:hanging="360"/>
+      </w:pPr>
+      <w:rPr>
+        <w:rFonts w:ascii="Wingdings" w:hAnsi="Wingdings" w:hint="default"/>
+      </w:rPr>
+    </w:lvl>
+    <w:lvl w:ilvl="3" w:tplc="04090001" w:tentative="1">
+      <w:start w:val="1"/>
+      <w:numFmt w:val="bullet"/>
+      <w:lvlText w:val=""/>
+      <w:lvlJc w:val="left"/>
+      <w:pPr>
+        <w:ind w:left="2880" w:hanging="360"/>
+      </w:pPr>
+      <w:rPr>
+        <w:rFonts w:ascii="Symbol" w:hAnsi="Symbol" w:hint="default"/>
+      </w:rPr>
+    </w:lvl>
+    <w:lvl w:ilvl="4" w:tplc="04090003" w:tentative="1">
+      <w:start w:val="1"/>
+      <w:numFmt w:val="bullet"/>
+      <w:lvlText w:val="o"/>
+      <w:lvlJc w:val="left"/>
+      <w:pPr>
+        <w:ind w:left="3600" w:hanging="360"/>
+      </w:pPr>
+      <w:rPr>
+        <w:rFonts w:ascii="Courier New" w:hAnsi="Courier New" w:cs="Courier New" w:hint="default"/>
+      </w:rPr>
+    </w:lvl>
+    <w:lvl w:ilvl="5" w:tplc="04090005" w:tentative="1">
+      <w:start w:val="1"/>
+      <w:numFmt w:val="bullet"/>
+      <w:lvlText w:val=""/>
+      <w:lvlJc w:val="left"/>
+      <w:pPr>
+        <w:ind w:left="4320" w:hanging="360"/>
+      </w:pPr>
+      <w:rPr>
+        <w:rFonts w:ascii="Wingdings" w:hAnsi="Wingdings" w:hint="default"/>
+      </w:rPr>
+    </w:lvl>
+    <w:lvl w:ilvl="6" w:tplc="04090001" w:tentative="1">
+      <w:start w:val="1"/>
+      <w:numFmt w:val="bullet"/>
+      <w:lvlText w:val=""/>
+      <w:lvlJc w:val="left"/>
+      <w:pPr>
+        <w:ind w:left="5040" w:hanging="360"/>
+      </w:pPr>
+      <w:rPr>
+        <w:rFonts w:ascii="Symbol" w:hAnsi="Symbol" w:hint="default"/>
+      </w:rPr>
+    </w:lvl>
+    <w:lvl w:ilvl="7" w:tplc="04090003" w:tentative="1">
+      <w:start w:val="1"/>
+      <w:numFmt w:val="bullet"/>
+      <w:lvlText w:val="o"/>
+      <w:lvlJc w:val="left"/>
+      <w:pPr>
+        <w:ind w:left="5760" w:hanging="360"/>
+      </w:pPr>
+      <w:rPr>
+        <w:rFonts w:ascii="Courier New" w:hAnsi="Courier New" w:cs="Courier New" w:hint="default"/>
+      </w:rPr>
+    </w:lvl>
+    <w:lvl w:ilvl="8" w:tplc="04090005" w:tentative="1">
+      <w:start w:val="1"/>
+      <w:numFmt w:val="bullet"/>
+      <w:lvlText w:val=""/>
+      <w:lvlJc w:val="left"/>
+      <w:pPr>
+        <w:ind w:left="6480" w:hanging="360"/>
+      </w:pPr>
+      <w:rPr>
+        <w:rFonts w:ascii="Wingdings" w:hAnsi="Wingdings" w:hint="default"/>
+      </w:rPr>
+    </w:lvl>
+  </w:abstractNum>
+  <w:abstractNum w:abstractNumId="7" w15:restartNumberingAfterBreak="0">
+    <w:nsid w:val="503B292A"/>
+    <w:multiLevelType w:val="hybridMultilevel"/>
+    <w:tmpl w:val="EE0E2C00"/>
+    <w:lvl w:ilvl="0" w:tplc="04090001">
+      <w:start w:val="1"/>
+      <w:numFmt w:val="bullet"/>
+      <w:lvlText w:val=""/>
+      <w:lvlJc w:val="left"/>
+      <w:pPr>
+        <w:ind w:left="720" w:hanging="360"/>
+      </w:pPr>
+      <w:rPr>
+        <w:rFonts w:ascii="Symbol" w:hAnsi="Symbol" w:hint="default"/>
+      </w:rPr>
+    </w:lvl>
+    <w:lvl w:ilvl="1" w:tplc="04090003" w:tentative="1">
+      <w:start w:val="1"/>
+      <w:numFmt w:val="bullet"/>
+      <w:lvlText w:val="o"/>
+      <w:lvlJc w:val="left"/>
+      <w:pPr>
+        <w:ind w:left="1440" w:hanging="360"/>
+      </w:pPr>
+      <w:rPr>
+        <w:rFonts w:ascii="Courier New" w:hAnsi="Courier New" w:cs="Courier New" w:hint="default"/>
+      </w:rPr>
+    </w:lvl>
+    <w:lvl w:ilvl="2" w:tplc="04090005" w:tentative="1">
+      <w:start w:val="1"/>
+      <w:numFmt w:val="bullet"/>
+      <w:lvlText w:val=""/>
+      <w:lvlJc w:val="left"/>
+      <w:pPr>
+        <w:ind w:left="2160" w:hanging="360"/>
+      </w:pPr>
+      <w:rPr>
+        <w:rFonts w:ascii="Wingdings" w:hAnsi="Wingdings" w:hint="default"/>
+      </w:rPr>
+    </w:lvl>
+    <w:lvl w:ilvl="3" w:tplc="04090001" w:tentative="1">
+      <w:start w:val="1"/>
+      <w:numFmt w:val="bullet"/>
+      <w:lvlText w:val=""/>
+      <w:lvlJc w:val="left"/>
+      <w:pPr>
+        <w:ind w:left="2880" w:hanging="360"/>
+      </w:pPr>
+      <w:rPr>
+        <w:rFonts w:ascii="Symbol" w:hAnsi="Symbol" w:hint="default"/>
+      </w:rPr>
+    </w:lvl>
+    <w:lvl w:ilvl="4" w:tplc="04090003" w:tentative="1">
+      <w:start w:val="1"/>
+      <w:numFmt w:val="bullet"/>
+      <w:lvlText w:val="o"/>
+      <w:lvlJc w:val="left"/>
+      <w:pPr>
+        <w:ind w:left="3600" w:hanging="360"/>
+      </w:pPr>
+      <w:rPr>
+        <w:rFonts w:ascii="Courier New" w:hAnsi="Courier New" w:cs="Courier New" w:hint="default"/>
+      </w:rPr>
+    </w:lvl>
+    <w:lvl w:ilvl="5" w:tplc="04090005" w:tentative="1">
+      <w:start w:val="1"/>
+      <w:numFmt w:val="bullet"/>
+      <w:lvlText w:val=""/>
+      <w:lvlJc w:val="left"/>
+      <w:pPr>
+        <w:ind w:left="4320" w:hanging="360"/>
+      </w:pPr>
+      <w:rPr>
+        <w:rFonts w:ascii="Wingdings" w:hAnsi="Wingdings" w:hint="default"/>
+      </w:rPr>
+    </w:lvl>
+    <w:lvl w:ilvl="6" w:tplc="04090001" w:tentative="1">
+      <w:start w:val="1"/>
+      <w:numFmt w:val="bullet"/>
+      <w:lvlText w:val=""/>
+      <w:lvlJc w:val="left"/>
+      <w:pPr>
+        <w:ind w:left="5040" w:hanging="360"/>
+      </w:pPr>
+      <w:rPr>
+        <w:rFonts w:ascii="Symbol" w:hAnsi="Symbol" w:hint="default"/>
+      </w:rPr>
+    </w:lvl>
+    <w:lvl w:ilvl="7" w:tplc="04090003" w:tentative="1">
+      <w:start w:val="1"/>
+      <w:numFmt w:val="bullet"/>
+      <w:lvlText w:val="o"/>
+      <w:lvlJc w:val="left"/>
+      <w:pPr>
+        <w:ind w:left="5760" w:hanging="360"/>
+      </w:pPr>
+      <w:rPr>
+        <w:rFonts w:ascii="Courier New" w:hAnsi="Courier New" w:cs="Courier New" w:hint="default"/>
+      </w:rPr>
+    </w:lvl>
+    <w:lvl w:ilvl="8" w:tplc="04090005" w:tentative="1">
+      <w:start w:val="1"/>
+      <w:numFmt w:val="bullet"/>
+      <w:lvlText w:val=""/>
+      <w:lvlJc w:val="left"/>
+      <w:pPr>
+        <w:ind w:left="6480" w:hanging="360"/>
+      </w:pPr>
+      <w:rPr>
+        <w:rFonts w:ascii="Wingdings" w:hAnsi="Wingdings" w:hint="default"/>
+      </w:rPr>
+    </w:lvl>
+  </w:abstractNum>
+  <w:abstractNum w:abstractNumId="8" w15:restartNumberingAfterBreak="0">
     <w:nsid w:val="50FB6125"/>
     <w:multiLevelType w:val="hybridMultilevel"/>
     <w:tmpl w:val="AA08A47C"/>
@@ -6679,7 +7047,120 @@
       </w:pPr>
     </w:lvl>
   </w:abstractNum>
-  <w:abstractNum w:abstractNumId="6" w15:restartNumberingAfterBreak="0">
+  <w:abstractNum w:abstractNumId="9" w15:restartNumberingAfterBreak="0">
+    <w:nsid w:val="54811B91"/>
+    <w:multiLevelType w:val="hybridMultilevel"/>
+    <w:tmpl w:val="A43ADA7A"/>
+    <w:lvl w:ilvl="0" w:tplc="04090001">
+      <w:start w:val="1"/>
+      <w:numFmt w:val="bullet"/>
+      <w:lvlText w:val=""/>
+      <w:lvlJc w:val="left"/>
+      <w:pPr>
+        <w:ind w:left="720" w:hanging="360"/>
+      </w:pPr>
+      <w:rPr>
+        <w:rFonts w:ascii="Symbol" w:hAnsi="Symbol" w:hint="default"/>
+      </w:rPr>
+    </w:lvl>
+    <w:lvl w:ilvl="1" w:tplc="04090003" w:tentative="1">
+      <w:start w:val="1"/>
+      <w:numFmt w:val="bullet"/>
+      <w:lvlText w:val="o"/>
+      <w:lvlJc w:val="left"/>
+      <w:pPr>
+        <w:ind w:left="1440" w:hanging="360"/>
+      </w:pPr>
+      <w:rPr>
+        <w:rFonts w:ascii="Courier New" w:hAnsi="Courier New" w:cs="Courier New" w:hint="default"/>
+      </w:rPr>
+    </w:lvl>
+    <w:lvl w:ilvl="2" w:tplc="04090005" w:tentative="1">
+      <w:start w:val="1"/>
+      <w:numFmt w:val="bullet"/>
+      <w:lvlText w:val=""/>
+      <w:lvlJc w:val="left"/>
+      <w:pPr>
+        <w:ind w:left="2160" w:hanging="360"/>
+      </w:pPr>
+      <w:rPr>
+        <w:rFonts w:ascii="Wingdings" w:hAnsi="Wingdings" w:hint="default"/>
+      </w:rPr>
+    </w:lvl>
+    <w:lvl w:ilvl="3" w:tplc="04090001" w:tentative="1">
+      <w:start w:val="1"/>
+      <w:numFmt w:val="bullet"/>
+      <w:lvlText w:val=""/>
+      <w:lvlJc w:val="left"/>
+      <w:pPr>
+        <w:ind w:left="2880" w:hanging="360"/>
+      </w:pPr>
+      <w:rPr>
+        <w:rFonts w:ascii="Symbol" w:hAnsi="Symbol" w:hint="default"/>
+      </w:rPr>
+    </w:lvl>
+    <w:lvl w:ilvl="4" w:tplc="04090003" w:tentative="1">
+      <w:start w:val="1"/>
+      <w:numFmt w:val="bullet"/>
+      <w:lvlText w:val="o"/>
+      <w:lvlJc w:val="left"/>
+      <w:pPr>
+        <w:ind w:left="3600" w:hanging="360"/>
+      </w:pPr>
+      <w:rPr>
+        <w:rFonts w:ascii="Courier New" w:hAnsi="Courier New" w:cs="Courier New" w:hint="default"/>
+      </w:rPr>
+    </w:lvl>
+    <w:lvl w:ilvl="5" w:tplc="04090005" w:tentative="1">
+      <w:start w:val="1"/>
+      <w:numFmt w:val="bullet"/>
+      <w:lvlText w:val=""/>
+      <w:lvlJc w:val="left"/>
+      <w:pPr>
+        <w:ind w:left="4320" w:hanging="360"/>
+      </w:pPr>
+      <w:rPr>
+        <w:rFonts w:ascii="Wingdings" w:hAnsi="Wingdings" w:hint="default"/>
+      </w:rPr>
+    </w:lvl>
+    <w:lvl w:ilvl="6" w:tplc="04090001" w:tentative="1">
+      <w:start w:val="1"/>
+      <w:numFmt w:val="bullet"/>
+      <w:lvlText w:val=""/>
+      <w:lvlJc w:val="left"/>
+      <w:pPr>
+        <w:ind w:left="5040" w:hanging="360"/>
+      </w:pPr>
+      <w:rPr>
+        <w:rFonts w:ascii="Symbol" w:hAnsi="Symbol" w:hint="default"/>
+      </w:rPr>
+    </w:lvl>
+    <w:lvl w:ilvl="7" w:tplc="04090003" w:tentative="1">
+      <w:start w:val="1"/>
+      <w:numFmt w:val="bullet"/>
+      <w:lvlText w:val="o"/>
+      <w:lvlJc w:val="left"/>
+      <w:pPr>
+        <w:ind w:left="5760" w:hanging="360"/>
+      </w:pPr>
+      <w:rPr>
+        <w:rFonts w:ascii="Courier New" w:hAnsi="Courier New" w:cs="Courier New" w:hint="default"/>
+      </w:rPr>
+    </w:lvl>
+    <w:lvl w:ilvl="8" w:tplc="04090005" w:tentative="1">
+      <w:start w:val="1"/>
+      <w:numFmt w:val="bullet"/>
+      <w:lvlText w:val=""/>
+      <w:lvlJc w:val="left"/>
+      <w:pPr>
+        <w:ind w:left="6480" w:hanging="360"/>
+      </w:pPr>
+      <w:rPr>
+        <w:rFonts w:ascii="Wingdings" w:hAnsi="Wingdings" w:hint="default"/>
+      </w:rPr>
+    </w:lvl>
+  </w:abstractNum>
+  <w:abstractNum w:abstractNumId="10" w15:restartNumberingAfterBreak="0">
     <w:nsid w:val="64AA1BA1"/>
     <w:multiLevelType w:val="hybridMultilevel"/>
     <w:tmpl w:val="4C302412"/>
@@ -6791,7 +7272,7 @@
       </w:rPr>
     </w:lvl>
   </w:abstractNum>
-  <w:abstractNum w:abstractNumId="7" w15:restartNumberingAfterBreak="0">
+  <w:abstractNum w:abstractNumId="11" w15:restartNumberingAfterBreak="0">
     <w:nsid w:val="66922990"/>
     <w:multiLevelType w:val="hybridMultilevel"/>
     <w:tmpl w:val="7220A4AE"/>
@@ -6904,7 +7385,120 @@
       </w:rPr>
     </w:lvl>
   </w:abstractNum>
-  <w:abstractNum w:abstractNumId="8" w15:restartNumberingAfterBreak="0">
+  <w:abstractNum w:abstractNumId="12" w15:restartNumberingAfterBreak="0">
+    <w:nsid w:val="680A0BAF"/>
+    <w:multiLevelType w:val="hybridMultilevel"/>
+    <w:tmpl w:val="E19CC2AE"/>
+    <w:lvl w:ilvl="0" w:tplc="04090001">
+      <w:start w:val="1"/>
+      <w:numFmt w:val="bullet"/>
+      <w:lvlText w:val=""/>
+      <w:lvlJc w:val="left"/>
+      <w:pPr>
+        <w:ind w:left="1080" w:hanging="360"/>
+      </w:pPr>
+      <w:rPr>
+        <w:rFonts w:ascii="Symbol" w:hAnsi="Symbol" w:hint="default"/>
+      </w:rPr>
+    </w:lvl>
+    <w:lvl w:ilvl="1" w:tplc="FFFFFFFF" w:tentative="1">
+      <w:start w:val="1"/>
+      <w:numFmt w:val="bullet"/>
+      <w:lvlText w:val="o"/>
+      <w:lvlJc w:val="left"/>
+      <w:pPr>
+        <w:ind w:left="1800" w:hanging="360"/>
+      </w:pPr>
+      <w:rPr>
+        <w:rFonts w:ascii="Courier New" w:hAnsi="Courier New" w:cs="Courier New" w:hint="default"/>
+      </w:rPr>
+    </w:lvl>
+    <w:lvl w:ilvl="2" w:tplc="FFFFFFFF" w:tentative="1">
+      <w:start w:val="1"/>
+      <w:numFmt w:val="bullet"/>
+      <w:lvlText w:val=""/>
+      <w:lvlJc w:val="left"/>
+      <w:pPr>
+        <w:ind w:left="2520" w:hanging="360"/>
+      </w:pPr>
+      <w:rPr>
+        <w:rFonts w:ascii="Wingdings" w:hAnsi="Wingdings" w:hint="default"/>
+      </w:rPr>
+    </w:lvl>
+    <w:lvl w:ilvl="3" w:tplc="FFFFFFFF" w:tentative="1">
+      <w:start w:val="1"/>
+      <w:numFmt w:val="bullet"/>
+      <w:lvlText w:val=""/>
+      <w:lvlJc w:val="left"/>
+      <w:pPr>
+        <w:ind w:left="3240" w:hanging="360"/>
+      </w:pPr>
+      <w:rPr>
+        <w:rFonts w:ascii="Symbol" w:hAnsi="Symbol" w:hint="default"/>
+      </w:rPr>
+    </w:lvl>
+    <w:lvl w:ilvl="4" w:tplc="FFFFFFFF" w:tentative="1">
+      <w:start w:val="1"/>
+      <w:numFmt w:val="bullet"/>
+      <w:lvlText w:val="o"/>
+      <w:lvlJc w:val="left"/>
+      <w:pPr>
+        <w:ind w:left="3960" w:hanging="360"/>
+      </w:pPr>
+      <w:rPr>
+        <w:rFonts w:ascii="Courier New" w:hAnsi="Courier New" w:cs="Courier New" w:hint="default"/>
+      </w:rPr>
+    </w:lvl>
+    <w:lvl w:ilvl="5" w:tplc="FFFFFFFF" w:tentative="1">
+      <w:start w:val="1"/>
+      <w:numFmt w:val="bullet"/>
+      <w:lvlText w:val=""/>
+      <w:lvlJc w:val="left"/>
+      <w:pPr>
+        <w:ind w:left="4680" w:hanging="360"/>
+      </w:pPr>
+      <w:rPr>
+        <w:rFonts w:ascii="Wingdings" w:hAnsi="Wingdings" w:hint="default"/>
+      </w:rPr>
+    </w:lvl>
+    <w:lvl w:ilvl="6" w:tplc="FFFFFFFF" w:tentative="1">
+      <w:start w:val="1"/>
+      <w:numFmt w:val="bullet"/>
+      <w:lvlText w:val=""/>
+      <w:lvlJc w:val="left"/>
+      <w:pPr>
+        <w:ind w:left="5400" w:hanging="360"/>
+      </w:pPr>
+      <w:rPr>
+        <w:rFonts w:ascii="Symbol" w:hAnsi="Symbol" w:hint="default"/>
+      </w:rPr>
+    </w:lvl>
+    <w:lvl w:ilvl="7" w:tplc="FFFFFFFF" w:tentative="1">
+      <w:start w:val="1"/>
+      <w:numFmt w:val="bullet"/>
+      <w:lvlText w:val="o"/>
+      <w:lvlJc w:val="left"/>
+      <w:pPr>
+        <w:ind w:left="6120" w:hanging="360"/>
+      </w:pPr>
+      <w:rPr>
+        <w:rFonts w:ascii="Courier New" w:hAnsi="Courier New" w:cs="Courier New" w:hint="default"/>
+      </w:rPr>
+    </w:lvl>
+    <w:lvl w:ilvl="8" w:tplc="FFFFFFFF" w:tentative="1">
+      <w:start w:val="1"/>
+      <w:numFmt w:val="bullet"/>
+      <w:lvlText w:val=""/>
+      <w:lvlJc w:val="left"/>
+      <w:pPr>
+        <w:ind w:left="6840" w:hanging="360"/>
+      </w:pPr>
+      <w:rPr>
+        <w:rFonts w:ascii="Wingdings" w:hAnsi="Wingdings" w:hint="default"/>
+      </w:rPr>
+    </w:lvl>
+  </w:abstractNum>
+  <w:abstractNum w:abstractNumId="13" w15:restartNumberingAfterBreak="0">
     <w:nsid w:val="77A26246"/>
     <w:multiLevelType w:val="hybridMultilevel"/>
     <w:tmpl w:val="08B44A9A"/>
@@ -7016,14 +7610,127 @@
       </w:rPr>
     </w:lvl>
   </w:abstractNum>
+  <w:abstractNum w:abstractNumId="14" w15:restartNumberingAfterBreak="0">
+    <w:nsid w:val="7E2A5747"/>
+    <w:multiLevelType w:val="hybridMultilevel"/>
+    <w:tmpl w:val="DCF407C0"/>
+    <w:lvl w:ilvl="0" w:tplc="04090001">
+      <w:start w:val="1"/>
+      <w:numFmt w:val="bullet"/>
+      <w:lvlText w:val=""/>
+      <w:lvlJc w:val="left"/>
+      <w:pPr>
+        <w:ind w:left="720" w:hanging="360"/>
+      </w:pPr>
+      <w:rPr>
+        <w:rFonts w:ascii="Symbol" w:hAnsi="Symbol" w:hint="default"/>
+      </w:rPr>
+    </w:lvl>
+    <w:lvl w:ilvl="1" w:tplc="04090003" w:tentative="1">
+      <w:start w:val="1"/>
+      <w:numFmt w:val="bullet"/>
+      <w:lvlText w:val="o"/>
+      <w:lvlJc w:val="left"/>
+      <w:pPr>
+        <w:ind w:left="1440" w:hanging="360"/>
+      </w:pPr>
+      <w:rPr>
+        <w:rFonts w:ascii="Courier New" w:hAnsi="Courier New" w:cs="Courier New" w:hint="default"/>
+      </w:rPr>
+    </w:lvl>
+    <w:lvl w:ilvl="2" w:tplc="04090005" w:tentative="1">
+      <w:start w:val="1"/>
+      <w:numFmt w:val="bullet"/>
+      <w:lvlText w:val=""/>
+      <w:lvlJc w:val="left"/>
+      <w:pPr>
+        <w:ind w:left="2160" w:hanging="360"/>
+      </w:pPr>
+      <w:rPr>
+        <w:rFonts w:ascii="Wingdings" w:hAnsi="Wingdings" w:hint="default"/>
+      </w:rPr>
+    </w:lvl>
+    <w:lvl w:ilvl="3" w:tplc="04090001" w:tentative="1">
+      <w:start w:val="1"/>
+      <w:numFmt w:val="bullet"/>
+      <w:lvlText w:val=""/>
+      <w:lvlJc w:val="left"/>
+      <w:pPr>
+        <w:ind w:left="2880" w:hanging="360"/>
+      </w:pPr>
+      <w:rPr>
+        <w:rFonts w:ascii="Symbol" w:hAnsi="Symbol" w:hint="default"/>
+      </w:rPr>
+    </w:lvl>
+    <w:lvl w:ilvl="4" w:tplc="04090003" w:tentative="1">
+      <w:start w:val="1"/>
+      <w:numFmt w:val="bullet"/>
+      <w:lvlText w:val="o"/>
+      <w:lvlJc w:val="left"/>
+      <w:pPr>
+        <w:ind w:left="3600" w:hanging="360"/>
+      </w:pPr>
+      <w:rPr>
+        <w:rFonts w:ascii="Courier New" w:hAnsi="Courier New" w:cs="Courier New" w:hint="default"/>
+      </w:rPr>
+    </w:lvl>
+    <w:lvl w:ilvl="5" w:tplc="04090005" w:tentative="1">
+      <w:start w:val="1"/>
+      <w:numFmt w:val="bullet"/>
+      <w:lvlText w:val=""/>
+      <w:lvlJc w:val="left"/>
+      <w:pPr>
+        <w:ind w:left="4320" w:hanging="360"/>
+      </w:pPr>
+      <w:rPr>
+        <w:rFonts w:ascii="Wingdings" w:hAnsi="Wingdings" w:hint="default"/>
+      </w:rPr>
+    </w:lvl>
+    <w:lvl w:ilvl="6" w:tplc="04090001" w:tentative="1">
+      <w:start w:val="1"/>
+      <w:numFmt w:val="bullet"/>
+      <w:lvlText w:val=""/>
+      <w:lvlJc w:val="left"/>
+      <w:pPr>
+        <w:ind w:left="5040" w:hanging="360"/>
+      </w:pPr>
+      <w:rPr>
+        <w:rFonts w:ascii="Symbol" w:hAnsi="Symbol" w:hint="default"/>
+      </w:rPr>
+    </w:lvl>
+    <w:lvl w:ilvl="7" w:tplc="04090003" w:tentative="1">
+      <w:start w:val="1"/>
+      <w:numFmt w:val="bullet"/>
+      <w:lvlText w:val="o"/>
+      <w:lvlJc w:val="left"/>
+      <w:pPr>
+        <w:ind w:left="5760" w:hanging="360"/>
+      </w:pPr>
+      <w:rPr>
+        <w:rFonts w:ascii="Courier New" w:hAnsi="Courier New" w:cs="Courier New" w:hint="default"/>
+      </w:rPr>
+    </w:lvl>
+    <w:lvl w:ilvl="8" w:tplc="04090005" w:tentative="1">
+      <w:start w:val="1"/>
+      <w:numFmt w:val="bullet"/>
+      <w:lvlText w:val=""/>
+      <w:lvlJc w:val="left"/>
+      <w:pPr>
+        <w:ind w:left="6480" w:hanging="360"/>
+      </w:pPr>
+      <w:rPr>
+        <w:rFonts w:ascii="Wingdings" w:hAnsi="Wingdings" w:hint="default"/>
+      </w:rPr>
+    </w:lvl>
+  </w:abstractNum>
   <w:num w:numId="1" w16cid:durableId="985865416">
-    <w:abstractNumId w:val="5"/>
+    <w:abstractNumId w:val="8"/>
   </w:num>
   <w:num w:numId="2" w16cid:durableId="1357997118">
-    <w:abstractNumId w:val="7"/>
+    <w:abstractNumId w:val="11"/>
   </w:num>
   <w:num w:numId="3" w16cid:durableId="1719890426">
-    <w:abstractNumId w:val="6"/>
+    <w:abstractNumId w:val="10"/>
   </w:num>
   <w:num w:numId="4" w16cid:durableId="33162647">
     <w:abstractNumId w:val="4"/>
@@ -7032,7 +7739,7 @@
     <w:abstractNumId w:val="3"/>
   </w:num>
   <w:num w:numId="6" w16cid:durableId="1067536879">
-    <w:abstractNumId w:val="8"/>
+    <w:abstractNumId w:val="13"/>
   </w:num>
   <w:num w:numId="7" w16cid:durableId="2023317445">
     <w:abstractNumId w:val="1"/>
@@ -7043,12 +7750,30 @@
   <w:num w:numId="9" w16cid:durableId="820581353">
     <w:abstractNumId w:val="2"/>
   </w:num>
+  <w:num w:numId="10" w16cid:durableId="1507940624">
+    <w:abstractNumId w:val="12"/>
+  </w:num>
+  <w:num w:numId="11" w16cid:durableId="714278836">
+    <w:abstractNumId w:val="6"/>
+  </w:num>
+  <w:num w:numId="12" w16cid:durableId="54353374">
+    <w:abstractNumId w:val="7"/>
+  </w:num>
+  <w:num w:numId="13" w16cid:durableId="1860467046">
+    <w:abstractNumId w:val="14"/>
+  </w:num>
+  <w:num w:numId="14" w16cid:durableId="333148926">
+    <w:abstractNumId w:val="5"/>
+  </w:num>
+  <w:num w:numId="15" w16cid:durableId="140779103">
+    <w:abstractNumId w:val="9"/>
+  </w:num>
   <w:numIdMacAtCleanup w:val="9"/>
 </w:numbering>
 </file>
 
 <file path=word/styles.xml><?xml version="1.0" encoding="utf-8"?>
-<w:styles xmlns:mc="http://schemas.openxmlformats.org/markup-compatibility/2006" xmlns:r="http://schemas.openxmlformats.org/officeDocument/2006/relationships" xmlns:w="http://schemas.openxmlformats.org/wordprocessingml/2006/main" xmlns:w14="http://schemas.microsoft.com/office/word/2010/wordml" xmlns:w15="http://schemas.microsoft.com/office/word/2012/wordml" xmlns:w16cex="http://schemas.microsoft.com/office/word/2018/wordml/cex" xmlns:w16cid="http://schemas.microsoft.com/office/word/2016/wordml/cid" xmlns:w16="http://schemas.microsoft.com/office/word/2018/wordml" xmlns:w16sdtdh="http://schemas.microsoft.com/office/word/2020/wordml/sdtdatahash" xmlns:w16se="http://schemas.microsoft.com/office/word/2015/wordml/symex" mc:Ignorable="w14 w15 w16se w16cid w16 w16cex w16sdtdh">
+<w:styles xmlns:mc="http://schemas.openxmlformats.org/markup-compatibility/2006" xmlns:r="http://schemas.openxmlformats.org/officeDocument/2006/relationships" xmlns:w="http://schemas.openxmlformats.org/wordprocessingml/2006/main" xmlns:w14="http://schemas.microsoft.com/office/word/2010/wordml" xmlns:w15="http://schemas.microsoft.com/office/word/2012/wordml" xmlns:w16cex="http://schemas.microsoft.com/office/word/2018/wordml/cex" xmlns:w16cid="http://schemas.microsoft.com/office/word/2016/wordml/cid" xmlns:w16="http://schemas.microsoft.com/office/word/2018/wordml" xmlns:w16du="http://schemas.microsoft.com/office/word/2023/wordml/word16du" xmlns:w16sdtdh="http://schemas.microsoft.com/office/word/2020/wordml/sdtdatahash" xmlns:w16sdtfl="http://schemas.microsoft.com/office/word/2024/wordml/sdtformatlock" xmlns:w16se="http://schemas.microsoft.com/office/word/2015/wordml/symex" mc:Ignorable="w14 w15 w16se w16cid w16 w16cex w16sdtdh w16sdtfl w16du">
   <w:docDefaults>
     <w:rPrDefault>
       <w:rPr>

</xml_diff>